<commit_message>
AVV unterschriftsreif: weisungsberechtigte Personen und Haftungsverweis
Im Dokument standen keine Platzhalter - die Unterstriche sind die
Unterschriftslinien. Zwei inhaltliche Luecken geschlossen, die im Prueflauf
zurueckgekommen waeren:

Ziffer 1.5 (neu) benennt die weisungsberechtigten Personen nach
Art. 28 Abs. 3 lit. a DSGVO: gesetzliche Vertreter und Prokuristen von
biotec sowie die Projektansprechpartner Nicole Krupa und Michael Brand,
Weisungen in Textform. Ohne Platzhalter formuliert.

Ziffer 8.1 verweist auf das zugrunde liegende Vertragsverhaeltnis - das
gibt es noch nicht. Ergaenzt um den Rueckfall auf die gesetzlichen
Vorschriften.

Co-Authored-By: Claude Opus 5 <noreply@anthropic.com>
Claude-Session: https://claude.ai/code/session_01GFfZvJBCzXCmDgx3EnU1YB
</commit_message>
<xml_diff>
--- a/04_Kundendokumente/AVV_CertoClav_biotec.docx
+++ b/04_Kundendokumente/AVV_CertoClav_biotec.docx
@@ -328,6 +328,34 @@
           <w:sz w:val="20"/>
         </w:rPr>
         <w:t xml:space="preserve"> benannten Empfänger und nur auf Grundlage eines Angemessenheitsbeschlusses der Europäischen Kommission oder geeigneter Garantien nach Art. 46 DSGVO, insbesondere der Standardvertragsklauseln.</w:t>
+      </w:r>
+    </w:p>
+    <w:p>
+      <w:pPr>
+        <w:spacing w:after="100"/>
+        <w:ind w:left="624" w:hanging="624"/>
+      </w:pPr>
+      <w:r>
+        <w:rPr>
+          <w:b/>
+          <w:sz w:val="20"/>
+        </w:rPr>
+        <w:t>1.5</w:t>
+        <w:tab/>
+      </w:r>
+      <w:r>
+        <w:rPr>
+          <w:b/>
+          <w:sz w:val="20"/>
+        </w:rPr>
+        <w:t>Weisungsberechtigt</w:t>
+      </w:r>
+      <w:r>
+        <w:rPr>
+          <w:b w:val="0"/>
+          <w:sz w:val="20"/>
+        </w:rPr>
+        <w:t xml:space="preserve"> auf Seiten des Verantwortlichen sind seine gesetzlichen Vertreter und Prokuristen sowie die von biotec benannten Projektansprechpartner, derzeit Nicole Krupa und Michael Brand. Weisungen nimmt auf Seiten des Auftragsverarbeiters Michael Simon entgegen. Weisungen werden in Textform erteilt; mündlich erteilte Weisungen bestätigt der Auftragsverarbeiter in Textform.</w:t>
       </w:r>
     </w:p>
     <w:p>
@@ -1104,7 +1132,7 @@
           <w:b w:val="0"/>
           <w:sz w:val="20"/>
         </w:rPr>
-        <w:t>Es gilt Art. 82 DSGVO. Im Übrigen richtet sich die Haftung nach den Vereinbarungen des zugrunde liegenden Vertragsverhältnisses.</w:t>
+        <w:t>Es gilt Art. 82 DSGVO. Im Übrigen richtet sich die Haftung nach den Vereinbarungen des zugrunde liegenden Vertragsverhältnisses, soweit ein solches besteht, andernfalls nach den gesetzlichen Vorschriften.</w:t>
       </w:r>
     </w:p>
     <w:p>

</xml_diff>